<commit_message>
Renamed my model file
</commit_message>
<xml_diff>
--- a/Bi-lstm-DL.docx
+++ b/Bi-lstm-DL.docx
@@ -1739,7 +1739,7 @@
     <w:p>
       <w:r>
         <w:pict w14:anchorId="66687414">
-          <v:rect id="_x0000_i1044" style="width:0;height:1.5pt" o:hralign="center" o:hrstd="t" o:hr="t" fillcolor="#a0a0a0" stroked="f"/>
+          <v:rect id="_x0000_i1026" style="width:0;height:1.5pt" o:hralign="center" o:hrstd="t" o:hr="t" fillcolor="#a0a0a0" stroked="f"/>
         </w:pict>
       </w:r>
     </w:p>
@@ -2242,7 +2242,7 @@
     <w:p>
       <w:r>
         <w:pict w14:anchorId="503A0D5D">
-          <v:rect id="_x0000_i1045" style="width:0;height:1.5pt" o:hralign="center" o:hrstd="t" o:hr="t" fillcolor="#a0a0a0" stroked="f"/>
+          <v:rect id="_x0000_i1027" style="width:0;height:1.5pt" o:hralign="center" o:hrstd="t" o:hr="t" fillcolor="#a0a0a0" stroked="f"/>
         </w:pict>
       </w:r>
     </w:p>
@@ -2318,7 +2318,7 @@
     <w:p>
       <w:r>
         <w:pict w14:anchorId="5E1F8A6A">
-          <v:rect id="_x0000_i1046" style="width:0;height:1.5pt" o:hralign="center" o:hrstd="t" o:hr="t" fillcolor="#a0a0a0" stroked="f"/>
+          <v:rect id="_x0000_i1028" style="width:0;height:1.5pt" o:hralign="center" o:hrstd="t" o:hr="t" fillcolor="#a0a0a0" stroked="f"/>
         </w:pict>
       </w:r>
     </w:p>
@@ -2373,11 +2373,1424 @@
         <w:t>: Integrate weather API data or airport capacity stats to improve the binary detection accuracy beyond 56.28%.</w:t>
       </w:r>
     </w:p>
+    <w:p/>
+    <w:p/>
+    <w:p/>
+    <w:tbl>
+      <w:tblPr>
+        <w:tblStyle w:val="PlainTable4"/>
+        <w:tblW w:w="0" w:type="auto"/>
+        <w:tblLook w:val="04A0" w:firstRow="1" w:lastRow="0" w:firstColumn="1" w:lastColumn="0" w:noHBand="0" w:noVBand="1"/>
+      </w:tblPr>
+      <w:tblGrid>
+        <w:gridCol w:w="1663"/>
+        <w:gridCol w:w="2914"/>
+      </w:tblGrid>
+      <w:tr>
+        <w:trPr>
+          <w:cnfStyle w:val="100000000000" w:firstRow="1" w:lastRow="0" w:firstColumn="0" w:lastColumn="0" w:oddVBand="0" w:evenVBand="0" w:oddHBand="0" w:evenHBand="0" w:firstRowFirstColumn="0" w:firstRowLastColumn="0" w:lastRowFirstColumn="0" w:lastRowLastColumn="0"/>
+          <w:trHeight w:val="432"/>
+        </w:trPr>
+        <w:tc>
+          <w:tcPr>
+            <w:cnfStyle w:val="001000000000" w:firstRow="0" w:lastRow="0" w:firstColumn="1" w:lastColumn="0" w:oddVBand="0" w:evenVBand="0" w:oddHBand="0" w:evenHBand="0" w:firstRowFirstColumn="0" w:firstRowLastColumn="0" w:lastRowFirstColumn="0" w:lastRowLastColumn="0"/>
+            <w:tcW w:w="0" w:type="auto"/>
+            <w:gridSpan w:val="2"/>
+          </w:tcPr>
+          <w:p>
+            <w:pPr>
+              <w:pStyle w:val="NoSpacing"/>
+            </w:pPr>
+            <w:r>
+              <w:lastRenderedPageBreak/>
+              <w:t>Hyperparameters</w:t>
+            </w:r>
+          </w:p>
+        </w:tc>
+      </w:tr>
+      <w:tr>
+        <w:trPr>
+          <w:cnfStyle w:val="000000100000" w:firstRow="0" w:lastRow="0" w:firstColumn="0" w:lastColumn="0" w:oddVBand="0" w:evenVBand="0" w:oddHBand="1" w:evenHBand="0" w:firstRowFirstColumn="0" w:firstRowLastColumn="0" w:lastRowFirstColumn="0" w:lastRowLastColumn="0"/>
+          <w:trHeight w:val="432"/>
+        </w:trPr>
+        <w:tc>
+          <w:tcPr>
+            <w:cnfStyle w:val="001000000000" w:firstRow="0" w:lastRow="0" w:firstColumn="1" w:lastColumn="0" w:oddVBand="0" w:evenVBand="0" w:oddHBand="0" w:evenHBand="0" w:firstRowFirstColumn="0" w:firstRowLastColumn="0" w:lastRowFirstColumn="0" w:lastRowLastColumn="0"/>
+            <w:tcW w:w="0" w:type="auto"/>
+            <w:shd w:val="clear" w:color="auto" w:fill="A5C9EB" w:themeFill="text2" w:themeFillTint="40"/>
+            <w:hideMark/>
+          </w:tcPr>
+          <w:p>
+            <w:pPr>
+              <w:pStyle w:val="NoSpacing"/>
+            </w:pPr>
+            <w:r>
+              <w:t>Parameter</w:t>
+            </w:r>
+          </w:p>
+        </w:tc>
+        <w:tc>
+          <w:tcPr>
+            <w:tcW w:w="0" w:type="auto"/>
+            <w:shd w:val="clear" w:color="auto" w:fill="A5C9EB" w:themeFill="text2" w:themeFillTint="40"/>
+            <w:hideMark/>
+          </w:tcPr>
+          <w:p>
+            <w:pPr>
+              <w:pStyle w:val="NoSpacing"/>
+              <w:cnfStyle w:val="000000100000" w:firstRow="0" w:lastRow="0" w:firstColumn="0" w:lastColumn="0" w:oddVBand="0" w:evenVBand="0" w:oddHBand="1" w:evenHBand="0" w:firstRowFirstColumn="0" w:firstRowLastColumn="0" w:lastRowFirstColumn="0" w:lastRowLastColumn="0"/>
+              <w:rPr>
+                <w:b/>
+                <w:bCs/>
+              </w:rPr>
+            </w:pPr>
+            <w:r>
+              <w:rPr>
+                <w:b/>
+                <w:bCs/>
+              </w:rPr>
+              <w:t>Value</w:t>
+            </w:r>
+          </w:p>
+        </w:tc>
+      </w:tr>
+      <w:tr>
+        <w:trPr>
+          <w:trHeight w:val="432"/>
+        </w:trPr>
+        <w:tc>
+          <w:tcPr>
+            <w:cnfStyle w:val="001000000000" w:firstRow="0" w:lastRow="0" w:firstColumn="1" w:lastColumn="0" w:oddVBand="0" w:evenVBand="0" w:oddHBand="0" w:evenHBand="0" w:firstRowFirstColumn="0" w:firstRowLastColumn="0" w:lastRowFirstColumn="0" w:lastRowLastColumn="0"/>
+            <w:tcW w:w="0" w:type="auto"/>
+            <w:hideMark/>
+          </w:tcPr>
+          <w:p>
+            <w:pPr>
+              <w:pStyle w:val="NoSpacing"/>
+              <w:rPr>
+                <w:b w:val="0"/>
+                <w:bCs w:val="0"/>
+              </w:rPr>
+            </w:pPr>
+            <w:r>
+              <w:rPr>
+                <w:b w:val="0"/>
+                <w:bCs w:val="0"/>
+              </w:rPr>
+              <w:t>LSTM Units</w:t>
+            </w:r>
+          </w:p>
+        </w:tc>
+        <w:tc>
+          <w:tcPr>
+            <w:tcW w:w="0" w:type="auto"/>
+            <w:hideMark/>
+          </w:tcPr>
+          <w:p>
+            <w:pPr>
+              <w:pStyle w:val="NoSpacing"/>
+              <w:cnfStyle w:val="000000000000" w:firstRow="0" w:lastRow="0" w:firstColumn="0" w:lastColumn="0" w:oddVBand="0" w:evenVBand="0" w:oddHBand="0" w:evenHBand="0" w:firstRowFirstColumn="0" w:firstRowLastColumn="0" w:lastRowFirstColumn="0" w:lastRowLastColumn="0"/>
+            </w:pPr>
+            <w:r>
+              <w:t>128 (L1) \ 32 (L2)</w:t>
+            </w:r>
+          </w:p>
+        </w:tc>
+      </w:tr>
+      <w:tr>
+        <w:trPr>
+          <w:cnfStyle w:val="000000100000" w:firstRow="0" w:lastRow="0" w:firstColumn="0" w:lastColumn="0" w:oddVBand="0" w:evenVBand="0" w:oddHBand="1" w:evenHBand="0" w:firstRowFirstColumn="0" w:firstRowLastColumn="0" w:lastRowFirstColumn="0" w:lastRowLastColumn="0"/>
+          <w:trHeight w:val="432"/>
+        </w:trPr>
+        <w:tc>
+          <w:tcPr>
+            <w:cnfStyle w:val="001000000000" w:firstRow="0" w:lastRow="0" w:firstColumn="1" w:lastColumn="0" w:oddVBand="0" w:evenVBand="0" w:oddHBand="0" w:evenHBand="0" w:firstRowFirstColumn="0" w:firstRowLastColumn="0" w:lastRowFirstColumn="0" w:lastRowLastColumn="0"/>
+            <w:tcW w:w="0" w:type="auto"/>
+            <w:hideMark/>
+          </w:tcPr>
+          <w:p>
+            <w:pPr>
+              <w:pStyle w:val="NoSpacing"/>
+              <w:rPr>
+                <w:b w:val="0"/>
+                <w:bCs w:val="0"/>
+              </w:rPr>
+            </w:pPr>
+            <w:r>
+              <w:rPr>
+                <w:b w:val="0"/>
+                <w:bCs w:val="0"/>
+              </w:rPr>
+              <w:t>Window Size</w:t>
+            </w:r>
+          </w:p>
+        </w:tc>
+        <w:tc>
+          <w:tcPr>
+            <w:tcW w:w="0" w:type="auto"/>
+            <w:hideMark/>
+          </w:tcPr>
+          <w:p>
+            <w:pPr>
+              <w:pStyle w:val="NoSpacing"/>
+              <w:cnfStyle w:val="000000100000" w:firstRow="0" w:lastRow="0" w:firstColumn="0" w:lastColumn="0" w:oddVBand="0" w:evenVBand="0" w:oddHBand="1" w:evenHBand="0" w:firstRowFirstColumn="0" w:firstRowLastColumn="0" w:lastRowFirstColumn="0" w:lastRowLastColumn="0"/>
+            </w:pPr>
+            <w:r>
+              <w:t>10 Flights</w:t>
+            </w:r>
+          </w:p>
+        </w:tc>
+      </w:tr>
+      <w:tr>
+        <w:trPr>
+          <w:trHeight w:val="432"/>
+        </w:trPr>
+        <w:tc>
+          <w:tcPr>
+            <w:cnfStyle w:val="001000000000" w:firstRow="0" w:lastRow="0" w:firstColumn="1" w:lastColumn="0" w:oddVBand="0" w:evenVBand="0" w:oddHBand="0" w:evenHBand="0" w:firstRowFirstColumn="0" w:firstRowLastColumn="0" w:lastRowFirstColumn="0" w:lastRowLastColumn="0"/>
+            <w:tcW w:w="0" w:type="auto"/>
+            <w:shd w:val="clear" w:color="auto" w:fill="ECE0EA"/>
+            <w:hideMark/>
+          </w:tcPr>
+          <w:p>
+            <w:pPr>
+              <w:pStyle w:val="NoSpacing"/>
+              <w:rPr>
+                <w:b w:val="0"/>
+                <w:bCs w:val="0"/>
+              </w:rPr>
+            </w:pPr>
+            <w:r>
+              <w:rPr>
+                <w:b w:val="0"/>
+                <w:bCs w:val="0"/>
+              </w:rPr>
+              <w:t>Optimizer</w:t>
+            </w:r>
+          </w:p>
+        </w:tc>
+        <w:tc>
+          <w:tcPr>
+            <w:tcW w:w="0" w:type="auto"/>
+            <w:shd w:val="clear" w:color="auto" w:fill="ECE0EA"/>
+            <w:hideMark/>
+          </w:tcPr>
+          <w:p>
+            <w:pPr>
+              <w:pStyle w:val="NoSpacing"/>
+              <w:cnfStyle w:val="000000000000" w:firstRow="0" w:lastRow="0" w:firstColumn="0" w:lastColumn="0" w:oddVBand="0" w:evenVBand="0" w:oddHBand="0" w:evenHBand="0" w:firstRowFirstColumn="0" w:firstRowLastColumn="0" w:lastRowFirstColumn="0" w:lastRowLastColumn="0"/>
+            </w:pPr>
+            <w:r>
+              <w:t>RMSprop</w:t>
+            </w:r>
+          </w:p>
+        </w:tc>
+      </w:tr>
+      <w:tr>
+        <w:trPr>
+          <w:cnfStyle w:val="000000100000" w:firstRow="0" w:lastRow="0" w:firstColumn="0" w:lastColumn="0" w:oddVBand="0" w:evenVBand="0" w:oddHBand="1" w:evenHBand="0" w:firstRowFirstColumn="0" w:firstRowLastColumn="0" w:lastRowFirstColumn="0" w:lastRowLastColumn="0"/>
+          <w:trHeight w:val="432"/>
+        </w:trPr>
+        <w:tc>
+          <w:tcPr>
+            <w:cnfStyle w:val="001000000000" w:firstRow="0" w:lastRow="0" w:firstColumn="1" w:lastColumn="0" w:oddVBand="0" w:evenVBand="0" w:oddHBand="0" w:evenHBand="0" w:firstRowFirstColumn="0" w:firstRowLastColumn="0" w:lastRowFirstColumn="0" w:lastRowLastColumn="0"/>
+            <w:tcW w:w="0" w:type="auto"/>
+            <w:hideMark/>
+          </w:tcPr>
+          <w:p>
+            <w:pPr>
+              <w:pStyle w:val="NoSpacing"/>
+              <w:rPr>
+                <w:b w:val="0"/>
+                <w:bCs w:val="0"/>
+              </w:rPr>
+            </w:pPr>
+            <w:r>
+              <w:rPr>
+                <w:b w:val="0"/>
+                <w:bCs w:val="0"/>
+              </w:rPr>
+              <w:t>Loss Function</w:t>
+            </w:r>
+          </w:p>
+        </w:tc>
+        <w:tc>
+          <w:tcPr>
+            <w:tcW w:w="0" w:type="auto"/>
+            <w:hideMark/>
+          </w:tcPr>
+          <w:p>
+            <w:pPr>
+              <w:pStyle w:val="NoSpacing"/>
+              <w:cnfStyle w:val="000000100000" w:firstRow="0" w:lastRow="0" w:firstColumn="0" w:lastColumn="0" w:oddVBand="0" w:evenVBand="0" w:oddHBand="1" w:evenHBand="0" w:firstRowFirstColumn="0" w:firstRowLastColumn="0" w:lastRowFirstColumn="0" w:lastRowLastColumn="0"/>
+            </w:pPr>
+            <w:r>
+              <w:t>MSE (Mean Squared Error)</w:t>
+            </w:r>
+          </w:p>
+        </w:tc>
+      </w:tr>
+      <w:tr>
+        <w:trPr>
+          <w:trHeight w:val="432"/>
+        </w:trPr>
+        <w:tc>
+          <w:tcPr>
+            <w:cnfStyle w:val="001000000000" w:firstRow="0" w:lastRow="0" w:firstColumn="1" w:lastColumn="0" w:oddVBand="0" w:evenVBand="0" w:oddHBand="0" w:evenHBand="0" w:firstRowFirstColumn="0" w:firstRowLastColumn="0" w:lastRowFirstColumn="0" w:lastRowLastColumn="0"/>
+            <w:tcW w:w="0" w:type="auto"/>
+            <w:hideMark/>
+          </w:tcPr>
+          <w:p>
+            <w:pPr>
+              <w:pStyle w:val="NoSpacing"/>
+              <w:rPr>
+                <w:b w:val="0"/>
+                <w:bCs w:val="0"/>
+              </w:rPr>
+            </w:pPr>
+            <w:r>
+              <w:rPr>
+                <w:b w:val="0"/>
+                <w:bCs w:val="0"/>
+              </w:rPr>
+              <w:t>Batch Size</w:t>
+            </w:r>
+          </w:p>
+        </w:tc>
+        <w:tc>
+          <w:tcPr>
+            <w:tcW w:w="0" w:type="auto"/>
+            <w:hideMark/>
+          </w:tcPr>
+          <w:p>
+            <w:pPr>
+              <w:pStyle w:val="NoSpacing"/>
+              <w:cnfStyle w:val="000000000000" w:firstRow="0" w:lastRow="0" w:firstColumn="0" w:lastColumn="0" w:oddVBand="0" w:evenVBand="0" w:oddHBand="0" w:evenHBand="0" w:firstRowFirstColumn="0" w:firstRowLastColumn="0" w:lastRowFirstColumn="0" w:lastRowLastColumn="0"/>
+            </w:pPr>
+            <w:r>
+              <w:t>512</w:t>
+            </w:r>
+          </w:p>
+        </w:tc>
+      </w:tr>
+      <w:tr>
+        <w:trPr>
+          <w:cnfStyle w:val="000000100000" w:firstRow="0" w:lastRow="0" w:firstColumn="0" w:lastColumn="0" w:oddVBand="0" w:evenVBand="0" w:oddHBand="1" w:evenHBand="0" w:firstRowFirstColumn="0" w:firstRowLastColumn="0" w:lastRowFirstColumn="0" w:lastRowLastColumn="0"/>
+          <w:trHeight w:val="432"/>
+        </w:trPr>
+        <w:tc>
+          <w:tcPr>
+            <w:cnfStyle w:val="001000000000" w:firstRow="0" w:lastRow="0" w:firstColumn="1" w:lastColumn="0" w:oddVBand="0" w:evenVBand="0" w:oddHBand="0" w:evenHBand="0" w:firstRowFirstColumn="0" w:firstRowLastColumn="0" w:lastRowFirstColumn="0" w:lastRowLastColumn="0"/>
+            <w:tcW w:w="0" w:type="auto"/>
+            <w:shd w:val="clear" w:color="auto" w:fill="ECE0EA"/>
+            <w:hideMark/>
+          </w:tcPr>
+          <w:p>
+            <w:pPr>
+              <w:pStyle w:val="NoSpacing"/>
+              <w:rPr>
+                <w:b w:val="0"/>
+                <w:bCs w:val="0"/>
+              </w:rPr>
+            </w:pPr>
+            <w:r>
+              <w:rPr>
+                <w:b w:val="0"/>
+                <w:bCs w:val="0"/>
+              </w:rPr>
+              <w:t>Dropout</w:t>
+            </w:r>
+          </w:p>
+        </w:tc>
+        <w:tc>
+          <w:tcPr>
+            <w:tcW w:w="0" w:type="auto"/>
+            <w:shd w:val="clear" w:color="auto" w:fill="ECE0EA"/>
+            <w:hideMark/>
+          </w:tcPr>
+          <w:p>
+            <w:pPr>
+              <w:pStyle w:val="NoSpacing"/>
+              <w:cnfStyle w:val="000000100000" w:firstRow="0" w:lastRow="0" w:firstColumn="0" w:lastColumn="0" w:oddVBand="0" w:evenVBand="0" w:oddHBand="1" w:evenHBand="0" w:firstRowFirstColumn="0" w:firstRowLastColumn="0" w:lastRowFirstColumn="0" w:lastRowLastColumn="0"/>
+            </w:pPr>
+            <w:r>
+              <w:t>0.2 (20%)</w:t>
+            </w:r>
+          </w:p>
+        </w:tc>
+      </w:tr>
+    </w:tbl>
     <w:p>
       <w:r>
+        <w:tab/>
+      </w:r>
+    </w:p>
+    <w:p>
+      <w:r>
         <w:br/>
       </w:r>
     </w:p>
+    <w:tbl>
+      <w:tblPr>
+        <w:tblStyle w:val="PlainTable4"/>
+        <w:tblW w:w="0" w:type="auto"/>
+        <w:tblLook w:val="04A0" w:firstRow="1" w:lastRow="0" w:firstColumn="1" w:lastColumn="0" w:noHBand="0" w:noVBand="1"/>
+      </w:tblPr>
+      <w:tblGrid>
+        <w:gridCol w:w="2216"/>
+        <w:gridCol w:w="2685"/>
+        <w:gridCol w:w="4025"/>
+      </w:tblGrid>
+      <w:tr>
+        <w:trPr>
+          <w:cnfStyle w:val="100000000000" w:firstRow="1" w:lastRow="0" w:firstColumn="0" w:lastColumn="0" w:oddVBand="0" w:evenVBand="0" w:oddHBand="0" w:evenHBand="0" w:firstRowFirstColumn="0" w:firstRowLastColumn="0" w:lastRowFirstColumn="0" w:lastRowLastColumn="0"/>
+        </w:trPr>
+        <w:tc>
+          <w:tcPr>
+            <w:cnfStyle w:val="001000000000" w:firstRow="0" w:lastRow="0" w:firstColumn="1" w:lastColumn="0" w:oddVBand="0" w:evenVBand="0" w:oddHBand="0" w:evenHBand="0" w:firstRowFirstColumn="0" w:firstRowLastColumn="0" w:lastRowFirstColumn="0" w:lastRowLastColumn="0"/>
+            <w:tcW w:w="0" w:type="auto"/>
+            <w:shd w:val="clear" w:color="auto" w:fill="A5C9EB" w:themeFill="text2" w:themeFillTint="40"/>
+            <w:hideMark/>
+          </w:tcPr>
+          <w:p>
+            <w:pPr>
+              <w:spacing w:after="160" w:line="278" w:lineRule="auto"/>
+            </w:pPr>
+            <w:r>
+              <w:t>Feature</w:t>
+            </w:r>
+          </w:p>
+        </w:tc>
+        <w:tc>
+          <w:tcPr>
+            <w:tcW w:w="0" w:type="auto"/>
+            <w:shd w:val="clear" w:color="auto" w:fill="A5C9EB" w:themeFill="text2" w:themeFillTint="40"/>
+            <w:hideMark/>
+          </w:tcPr>
+          <w:p>
+            <w:pPr>
+              <w:spacing w:after="160" w:line="278" w:lineRule="auto"/>
+              <w:cnfStyle w:val="100000000000" w:firstRow="1" w:lastRow="0" w:firstColumn="0" w:lastColumn="0" w:oddVBand="0" w:evenVBand="0" w:oddHBand="0" w:evenHBand="0" w:firstRowFirstColumn="0" w:firstRowLastColumn="0" w:lastRowFirstColumn="0" w:lastRowLastColumn="0"/>
+            </w:pPr>
+            <w:r>
+              <w:t>Baseline Model</w:t>
+            </w:r>
+          </w:p>
+        </w:tc>
+        <w:tc>
+          <w:tcPr>
+            <w:tcW w:w="0" w:type="auto"/>
+            <w:shd w:val="clear" w:color="auto" w:fill="A5C9EB" w:themeFill="text2" w:themeFillTint="40"/>
+            <w:hideMark/>
+          </w:tcPr>
+          <w:p>
+            <w:pPr>
+              <w:spacing w:after="160" w:line="278" w:lineRule="auto"/>
+              <w:cnfStyle w:val="100000000000" w:firstRow="1" w:lastRow="0" w:firstColumn="0" w:lastColumn="0" w:oddVBand="0" w:evenVBand="0" w:oddHBand="0" w:evenHBand="0" w:firstRowFirstColumn="0" w:firstRowLastColumn="0" w:lastRowFirstColumn="0" w:lastRowLastColumn="0"/>
+            </w:pPr>
+            <w:r>
+              <w:t>Proposed Multi-Task Model</w:t>
+            </w:r>
+          </w:p>
+        </w:tc>
+      </w:tr>
+      <w:tr>
+        <w:trPr>
+          <w:cnfStyle w:val="000000100000" w:firstRow="0" w:lastRow="0" w:firstColumn="0" w:lastColumn="0" w:oddVBand="0" w:evenVBand="0" w:oddHBand="1" w:evenHBand="0" w:firstRowFirstColumn="0" w:firstRowLastColumn="0" w:lastRowFirstColumn="0" w:lastRowLastColumn="0"/>
+        </w:trPr>
+        <w:tc>
+          <w:tcPr>
+            <w:cnfStyle w:val="001000000000" w:firstRow="0" w:lastRow="0" w:firstColumn="1" w:lastColumn="0" w:oddVBand="0" w:evenVBand="0" w:oddHBand="0" w:evenHBand="0" w:firstRowFirstColumn="0" w:firstRowLastColumn="0" w:lastRowFirstColumn="0" w:lastRowLastColumn="0"/>
+            <w:tcW w:w="0" w:type="auto"/>
+            <w:hideMark/>
+          </w:tcPr>
+          <w:p>
+            <w:pPr>
+              <w:spacing w:after="160" w:line="278" w:lineRule="auto"/>
+            </w:pPr>
+            <w:r>
+              <w:t>LSTM Direction</w:t>
+            </w:r>
+          </w:p>
+        </w:tc>
+        <w:tc>
+          <w:tcPr>
+            <w:tcW w:w="0" w:type="auto"/>
+            <w:hideMark/>
+          </w:tcPr>
+          <w:p>
+            <w:pPr>
+              <w:spacing w:after="160" w:line="278" w:lineRule="auto"/>
+              <w:cnfStyle w:val="000000100000" w:firstRow="0" w:lastRow="0" w:firstColumn="0" w:lastColumn="0" w:oddVBand="0" w:evenVBand="0" w:oddHBand="1" w:evenHBand="0" w:firstRowFirstColumn="0" w:firstRowLastColumn="0" w:lastRowFirstColumn="0" w:lastRowLastColumn="0"/>
+            </w:pPr>
+            <w:r>
+              <w:t>Unidirectional</w:t>
+            </w:r>
+          </w:p>
+        </w:tc>
+        <w:tc>
+          <w:tcPr>
+            <w:tcW w:w="0" w:type="auto"/>
+            <w:hideMark/>
+          </w:tcPr>
+          <w:p>
+            <w:pPr>
+              <w:spacing w:after="160" w:line="278" w:lineRule="auto"/>
+              <w:cnfStyle w:val="000000100000" w:firstRow="0" w:lastRow="0" w:firstColumn="0" w:lastColumn="0" w:oddVBand="0" w:evenVBand="0" w:oddHBand="1" w:evenHBand="0" w:firstRowFirstColumn="0" w:firstRowLastColumn="0" w:lastRowFirstColumn="0" w:lastRowLastColumn="0"/>
+            </w:pPr>
+            <w:r>
+              <w:rPr>
+                <w:b/>
+                <w:bCs/>
+              </w:rPr>
+              <w:t>Bidirectional</w:t>
+            </w:r>
+            <w:r>
+              <w:t xml:space="preserve"> (Doubles context)</w:t>
+            </w:r>
+          </w:p>
+        </w:tc>
+      </w:tr>
+      <w:tr>
+        <w:tc>
+          <w:tcPr>
+            <w:cnfStyle w:val="001000000000" w:firstRow="0" w:lastRow="0" w:firstColumn="1" w:lastColumn="0" w:oddVBand="0" w:evenVBand="0" w:oddHBand="0" w:evenHBand="0" w:firstRowFirstColumn="0" w:firstRowLastColumn="0" w:lastRowFirstColumn="0" w:lastRowLastColumn="0"/>
+            <w:tcW w:w="0" w:type="auto"/>
+            <w:hideMark/>
+          </w:tcPr>
+          <w:p>
+            <w:pPr>
+              <w:spacing w:after="160" w:line="278" w:lineRule="auto"/>
+            </w:pPr>
+            <w:r>
+              <w:t>Layer 2 Units</w:t>
+            </w:r>
+          </w:p>
+        </w:tc>
+        <w:tc>
+          <w:tcPr>
+            <w:tcW w:w="0" w:type="auto"/>
+            <w:hideMark/>
+          </w:tcPr>
+          <w:p>
+            <w:pPr>
+              <w:spacing w:after="160" w:line="278" w:lineRule="auto"/>
+              <w:cnfStyle w:val="000000000000" w:firstRow="0" w:lastRow="0" w:firstColumn="0" w:lastColumn="0" w:oddVBand="0" w:evenVBand="0" w:oddHBand="0" w:evenHBand="0" w:firstRowFirstColumn="0" w:firstRowLastColumn="0" w:lastRowFirstColumn="0" w:lastRowLastColumn="0"/>
+            </w:pPr>
+            <w:r>
+              <w:t>32 Units</w:t>
+            </w:r>
+          </w:p>
+        </w:tc>
+        <w:tc>
+          <w:tcPr>
+            <w:tcW w:w="0" w:type="auto"/>
+            <w:hideMark/>
+          </w:tcPr>
+          <w:p>
+            <w:pPr>
+              <w:spacing w:after="160" w:line="278" w:lineRule="auto"/>
+              <w:cnfStyle w:val="000000000000" w:firstRow="0" w:lastRow="0" w:firstColumn="0" w:lastColumn="0" w:oddVBand="0" w:evenVBand="0" w:oddHBand="0" w:evenHBand="0" w:firstRowFirstColumn="0" w:firstRowLastColumn="0" w:lastRowFirstColumn="0" w:lastRowLastColumn="0"/>
+            </w:pPr>
+            <w:r>
+              <w:rPr>
+                <w:b/>
+                <w:bCs/>
+              </w:rPr>
+              <w:t>64 Units</w:t>
+            </w:r>
+            <w:r>
+              <w:t xml:space="preserve"> (Higher capacity)</w:t>
+            </w:r>
+          </w:p>
+        </w:tc>
+      </w:tr>
+      <w:tr>
+        <w:trPr>
+          <w:cnfStyle w:val="000000100000" w:firstRow="0" w:lastRow="0" w:firstColumn="0" w:lastColumn="0" w:oddVBand="0" w:evenVBand="0" w:oddHBand="1" w:evenHBand="0" w:firstRowFirstColumn="0" w:firstRowLastColumn="0" w:lastRowFirstColumn="0" w:lastRowLastColumn="0"/>
+        </w:trPr>
+        <w:tc>
+          <w:tcPr>
+            <w:cnfStyle w:val="001000000000" w:firstRow="0" w:lastRow="0" w:firstColumn="1" w:lastColumn="0" w:oddVBand="0" w:evenVBand="0" w:oddHBand="0" w:evenHBand="0" w:firstRowFirstColumn="0" w:firstRowLastColumn="0" w:lastRowFirstColumn="0" w:lastRowLastColumn="0"/>
+            <w:tcW w:w="0" w:type="auto"/>
+            <w:shd w:val="clear" w:color="auto" w:fill="DAE9F7" w:themeFill="text2" w:themeFillTint="1A"/>
+            <w:hideMark/>
+          </w:tcPr>
+          <w:p>
+            <w:pPr>
+              <w:spacing w:after="160" w:line="278" w:lineRule="auto"/>
+            </w:pPr>
+            <w:r>
+              <w:t>Task Count</w:t>
+            </w:r>
+          </w:p>
+        </w:tc>
+        <w:tc>
+          <w:tcPr>
+            <w:tcW w:w="0" w:type="auto"/>
+            <w:shd w:val="clear" w:color="auto" w:fill="DAE9F7" w:themeFill="text2" w:themeFillTint="1A"/>
+            <w:hideMark/>
+          </w:tcPr>
+          <w:p>
+            <w:pPr>
+              <w:spacing w:after="160" w:line="278" w:lineRule="auto"/>
+              <w:cnfStyle w:val="000000100000" w:firstRow="0" w:lastRow="0" w:firstColumn="0" w:lastColumn="0" w:oddVBand="0" w:evenVBand="0" w:oddHBand="1" w:evenHBand="0" w:firstRowFirstColumn="0" w:firstRowLastColumn="0" w:lastRowFirstColumn="0" w:lastRowLastColumn="0"/>
+            </w:pPr>
+            <w:r>
+              <w:t>Single Task (Regression)</w:t>
+            </w:r>
+          </w:p>
+        </w:tc>
+        <w:tc>
+          <w:tcPr>
+            <w:tcW w:w="0" w:type="auto"/>
+            <w:shd w:val="clear" w:color="auto" w:fill="DAE9F7" w:themeFill="text2" w:themeFillTint="1A"/>
+            <w:hideMark/>
+          </w:tcPr>
+          <w:p>
+            <w:pPr>
+              <w:spacing w:after="160" w:line="278" w:lineRule="auto"/>
+              <w:cnfStyle w:val="000000100000" w:firstRow="0" w:lastRow="0" w:firstColumn="0" w:lastColumn="0" w:oddVBand="0" w:evenVBand="0" w:oddHBand="1" w:evenHBand="0" w:firstRowFirstColumn="0" w:firstRowLastColumn="0" w:lastRowFirstColumn="0" w:lastRowLastColumn="0"/>
+            </w:pPr>
+            <w:r>
+              <w:rPr>
+                <w:b/>
+                <w:bCs/>
+              </w:rPr>
+              <w:t>Multi-Task (3 Concurrent Tasks)</w:t>
+            </w:r>
+          </w:p>
+        </w:tc>
+      </w:tr>
+      <w:tr>
+        <w:tc>
+          <w:tcPr>
+            <w:cnfStyle w:val="001000000000" w:firstRow="0" w:lastRow="0" w:firstColumn="1" w:lastColumn="0" w:oddVBand="0" w:evenVBand="0" w:oddHBand="0" w:evenHBand="0" w:firstRowFirstColumn="0" w:firstRowLastColumn="0" w:lastRowFirstColumn="0" w:lastRowLastColumn="0"/>
+            <w:tcW w:w="0" w:type="auto"/>
+            <w:hideMark/>
+          </w:tcPr>
+          <w:p>
+            <w:pPr>
+              <w:spacing w:after="160" w:line="278" w:lineRule="auto"/>
+            </w:pPr>
+            <w:r>
+              <w:t>Loss Functions</w:t>
+            </w:r>
+          </w:p>
+        </w:tc>
+        <w:tc>
+          <w:tcPr>
+            <w:tcW w:w="0" w:type="auto"/>
+            <w:hideMark/>
+          </w:tcPr>
+          <w:p>
+            <w:pPr>
+              <w:spacing w:after="160" w:line="278" w:lineRule="auto"/>
+              <w:cnfStyle w:val="000000000000" w:firstRow="0" w:lastRow="0" w:firstColumn="0" w:lastColumn="0" w:oddVBand="0" w:evenVBand="0" w:oddHBand="0" w:evenHBand="0" w:firstRowFirstColumn="0" w:firstRowLastColumn="0" w:lastRowFirstColumn="0" w:lastRowLastColumn="0"/>
+            </w:pPr>
+            <w:r>
+              <w:t>MSE only</w:t>
+            </w:r>
+          </w:p>
+        </w:tc>
+        <w:tc>
+          <w:tcPr>
+            <w:tcW w:w="0" w:type="auto"/>
+            <w:hideMark/>
+          </w:tcPr>
+          <w:p>
+            <w:pPr>
+              <w:spacing w:after="160" w:line="278" w:lineRule="auto"/>
+              <w:cnfStyle w:val="000000000000" w:firstRow="0" w:lastRow="0" w:firstColumn="0" w:lastColumn="0" w:oddVBand="0" w:evenVBand="0" w:oddHBand="0" w:evenHBand="0" w:firstRowFirstColumn="0" w:firstRowLastColumn="0" w:lastRowFirstColumn="0" w:lastRowLastColumn="0"/>
+            </w:pPr>
+            <w:r>
+              <w:rPr>
+                <w:b/>
+                <w:bCs/>
+              </w:rPr>
+              <w:t>BCE, Sparse Categorical CE, &amp; MSE</w:t>
+            </w:r>
+          </w:p>
+        </w:tc>
+      </w:tr>
+      <w:tr>
+        <w:trPr>
+          <w:cnfStyle w:val="000000100000" w:firstRow="0" w:lastRow="0" w:firstColumn="0" w:lastColumn="0" w:oddVBand="0" w:evenVBand="0" w:oddHBand="1" w:evenHBand="0" w:firstRowFirstColumn="0" w:firstRowLastColumn="0" w:lastRowFirstColumn="0" w:lastRowLastColumn="0"/>
+        </w:trPr>
+        <w:tc>
+          <w:tcPr>
+            <w:cnfStyle w:val="001000000000" w:firstRow="0" w:lastRow="0" w:firstColumn="1" w:lastColumn="0" w:oddVBand="0" w:evenVBand="0" w:oddHBand="0" w:evenHBand="0" w:firstRowFirstColumn="0" w:firstRowLastColumn="0" w:lastRowFirstColumn="0" w:lastRowLastColumn="0"/>
+            <w:tcW w:w="0" w:type="auto"/>
+            <w:hideMark/>
+          </w:tcPr>
+          <w:p>
+            <w:pPr>
+              <w:spacing w:after="160" w:line="278" w:lineRule="auto"/>
+            </w:pPr>
+            <w:r>
+              <w:t>Output Heads</w:t>
+            </w:r>
+          </w:p>
+        </w:tc>
+        <w:tc>
+          <w:tcPr>
+            <w:tcW w:w="0" w:type="auto"/>
+            <w:hideMark/>
+          </w:tcPr>
+          <w:p>
+            <w:pPr>
+              <w:spacing w:after="160" w:line="278" w:lineRule="auto"/>
+              <w:cnfStyle w:val="000000100000" w:firstRow="0" w:lastRow="0" w:firstColumn="0" w:lastColumn="0" w:oddVBand="0" w:evenVBand="0" w:oddHBand="1" w:evenHBand="0" w:firstRowFirstColumn="0" w:firstRowLastColumn="0" w:lastRowFirstColumn="0" w:lastRowLastColumn="0"/>
+            </w:pPr>
+            <w:r>
+              <w:t>1 (Regression)</w:t>
+            </w:r>
+          </w:p>
+        </w:tc>
+        <w:tc>
+          <w:tcPr>
+            <w:tcW w:w="0" w:type="auto"/>
+            <w:hideMark/>
+          </w:tcPr>
+          <w:p>
+            <w:pPr>
+              <w:spacing w:after="160" w:line="278" w:lineRule="auto"/>
+              <w:cnfStyle w:val="000000100000" w:firstRow="0" w:lastRow="0" w:firstColumn="0" w:lastColumn="0" w:oddVBand="0" w:evenVBand="0" w:oddHBand="1" w:evenHBand="0" w:firstRowFirstColumn="0" w:firstRowLastColumn="0" w:lastRowFirstColumn="0" w:lastRowLastColumn="0"/>
+            </w:pPr>
+            <w:r>
+              <w:rPr>
+                <w:b/>
+                <w:bCs/>
+              </w:rPr>
+              <w:t>3 (Binary, Reason, Regression)</w:t>
+            </w:r>
+          </w:p>
+        </w:tc>
+      </w:tr>
+      <w:tr>
+        <w:tc>
+          <w:tcPr>
+            <w:cnfStyle w:val="001000000000" w:firstRow="0" w:lastRow="0" w:firstColumn="1" w:lastColumn="0" w:oddVBand="0" w:evenVBand="0" w:oddHBand="0" w:evenHBand="0" w:firstRowFirstColumn="0" w:firstRowLastColumn="0" w:lastRowFirstColumn="0" w:lastRowLastColumn="0"/>
+            <w:tcW w:w="0" w:type="auto"/>
+            <w:shd w:val="clear" w:color="auto" w:fill="DAE9F7" w:themeFill="text2" w:themeFillTint="1A"/>
+            <w:hideMark/>
+          </w:tcPr>
+          <w:p>
+            <w:pPr>
+              <w:spacing w:after="160" w:line="278" w:lineRule="auto"/>
+            </w:pPr>
+            <w:r>
+              <w:t>Feature Extraction</w:t>
+            </w:r>
+          </w:p>
+        </w:tc>
+        <w:tc>
+          <w:tcPr>
+            <w:tcW w:w="0" w:type="auto"/>
+            <w:shd w:val="clear" w:color="auto" w:fill="DAE9F7" w:themeFill="text2" w:themeFillTint="1A"/>
+            <w:hideMark/>
+          </w:tcPr>
+          <w:p>
+            <w:pPr>
+              <w:spacing w:after="160" w:line="278" w:lineRule="auto"/>
+              <w:cnfStyle w:val="000000000000" w:firstRow="0" w:lastRow="0" w:firstColumn="0" w:lastColumn="0" w:oddVBand="0" w:evenVBand="0" w:oddHBand="0" w:evenHBand="0" w:firstRowFirstColumn="0" w:firstRowLastColumn="0" w:lastRowFirstColumn="0" w:lastRowLastColumn="0"/>
+            </w:pPr>
+            <w:r>
+              <w:t>Numerical only</w:t>
+            </w:r>
+          </w:p>
+        </w:tc>
+        <w:tc>
+          <w:tcPr>
+            <w:tcW w:w="0" w:type="auto"/>
+            <w:shd w:val="clear" w:color="auto" w:fill="DAE9F7" w:themeFill="text2" w:themeFillTint="1A"/>
+            <w:hideMark/>
+          </w:tcPr>
+          <w:p>
+            <w:pPr>
+              <w:spacing w:after="160" w:line="278" w:lineRule="auto"/>
+              <w:cnfStyle w:val="000000000000" w:firstRow="0" w:lastRow="0" w:firstColumn="0" w:lastColumn="0" w:oddVBand="0" w:evenVBand="0" w:oddHBand="0" w:evenHBand="0" w:firstRowFirstColumn="0" w:firstRowLastColumn="0" w:lastRowFirstColumn="0" w:lastRowLastColumn="0"/>
+            </w:pPr>
+            <w:r>
+              <w:rPr>
+                <w:b/>
+                <w:bCs/>
+              </w:rPr>
+              <w:t>Categorical Embeddings (8-dim)</w:t>
+            </w:r>
+          </w:p>
+        </w:tc>
+      </w:tr>
+      <w:tr>
+        <w:trPr>
+          <w:cnfStyle w:val="000000100000" w:firstRow="0" w:lastRow="0" w:firstColumn="0" w:lastColumn="0" w:oddVBand="0" w:evenVBand="0" w:oddHBand="1" w:evenHBand="0" w:firstRowFirstColumn="0" w:firstRowLastColumn="0" w:lastRowFirstColumn="0" w:lastRowLastColumn="0"/>
+        </w:trPr>
+        <w:tc>
+          <w:tcPr>
+            <w:cnfStyle w:val="001000000000" w:firstRow="0" w:lastRow="0" w:firstColumn="1" w:lastColumn="0" w:oddVBand="0" w:evenVBand="0" w:oddHBand="0" w:evenHBand="0" w:firstRowFirstColumn="0" w:firstRowLastColumn="0" w:lastRowFirstColumn="0" w:lastRowLastColumn="0"/>
+            <w:tcW w:w="0" w:type="auto"/>
+            <w:hideMark/>
+          </w:tcPr>
+          <w:p>
+            <w:pPr>
+              <w:spacing w:after="160" w:line="278" w:lineRule="auto"/>
+            </w:pPr>
+            <w:r>
+              <w:t>Task Balancing</w:t>
+            </w:r>
+          </w:p>
+        </w:tc>
+        <w:tc>
+          <w:tcPr>
+            <w:tcW w:w="0" w:type="auto"/>
+            <w:hideMark/>
+          </w:tcPr>
+          <w:p>
+            <w:pPr>
+              <w:spacing w:after="160" w:line="278" w:lineRule="auto"/>
+              <w:cnfStyle w:val="000000100000" w:firstRow="0" w:lastRow="0" w:firstColumn="0" w:lastColumn="0" w:oddVBand="0" w:evenVBand="0" w:oddHBand="1" w:evenHBand="0" w:firstRowFirstColumn="0" w:firstRowLastColumn="0" w:lastRowFirstColumn="0" w:lastRowLastColumn="0"/>
+            </w:pPr>
+            <w:r>
+              <w:t>N/A</w:t>
+            </w:r>
+          </w:p>
+        </w:tc>
+        <w:tc>
+          <w:tcPr>
+            <w:tcW w:w="0" w:type="auto"/>
+            <w:hideMark/>
+          </w:tcPr>
+          <w:p>
+            <w:pPr>
+              <w:spacing w:after="160" w:line="278" w:lineRule="auto"/>
+              <w:cnfStyle w:val="000000100000" w:firstRow="0" w:lastRow="0" w:firstColumn="0" w:lastColumn="0" w:oddVBand="0" w:evenVBand="0" w:oddHBand="1" w:evenHBand="0" w:firstRowFirstColumn="0" w:firstRowLastColumn="0" w:lastRowFirstColumn="0" w:lastRowLastColumn="0"/>
+            </w:pPr>
+            <w:r>
+              <w:rPr>
+                <w:b/>
+                <w:bCs/>
+              </w:rPr>
+              <w:t>Weighted Loss (</w:t>
+            </w:r>
+            <w:proofErr w:type="gramStart"/>
+            <w:r>
+              <w:rPr>
+                <w:b/>
+                <w:bCs/>
+              </w:rPr>
+              <w:t>1.0 :</w:t>
+            </w:r>
+            <w:proofErr w:type="gramEnd"/>
+            <w:r>
+              <w:rPr>
+                <w:b/>
+                <w:bCs/>
+              </w:rPr>
+              <w:t xml:space="preserve"> </w:t>
+            </w:r>
+            <w:proofErr w:type="gramStart"/>
+            <w:r>
+              <w:rPr>
+                <w:b/>
+                <w:bCs/>
+              </w:rPr>
+              <w:t>0.8 :</w:t>
+            </w:r>
+            <w:proofErr w:type="gramEnd"/>
+            <w:r>
+              <w:rPr>
+                <w:b/>
+                <w:bCs/>
+              </w:rPr>
+              <w:t xml:space="preserve"> 1.2)</w:t>
+            </w:r>
+          </w:p>
+        </w:tc>
+      </w:tr>
+    </w:tbl>
+    <w:p/>
+    <w:tbl>
+      <w:tblPr>
+        <w:tblStyle w:val="PlainTable4"/>
+        <w:tblW w:w="0" w:type="auto"/>
+        <w:tblLook w:val="04A0" w:firstRow="1" w:lastRow="0" w:firstColumn="1" w:lastColumn="0" w:noHBand="0" w:noVBand="1"/>
+      </w:tblPr>
+      <w:tblGrid>
+        <w:gridCol w:w="2439"/>
+        <w:gridCol w:w="1744"/>
+        <w:gridCol w:w="2773"/>
+        <w:gridCol w:w="2404"/>
+      </w:tblGrid>
+      <w:tr>
+        <w:trPr>
+          <w:cnfStyle w:val="100000000000" w:firstRow="1" w:lastRow="0" w:firstColumn="0" w:lastColumn="0" w:oddVBand="0" w:evenVBand="0" w:oddHBand="0" w:evenHBand="0" w:firstRowFirstColumn="0" w:firstRowLastColumn="0" w:lastRowFirstColumn="0" w:lastRowLastColumn="0"/>
+        </w:trPr>
+        <w:tc>
+          <w:tcPr>
+            <w:cnfStyle w:val="001000000000" w:firstRow="0" w:lastRow="0" w:firstColumn="1" w:lastColumn="0" w:oddVBand="0" w:evenVBand="0" w:oddHBand="0" w:evenHBand="0" w:firstRowFirstColumn="0" w:firstRowLastColumn="0" w:lastRowFirstColumn="0" w:lastRowLastColumn="0"/>
+            <w:tcW w:w="0" w:type="auto"/>
+            <w:shd w:val="clear" w:color="auto" w:fill="A5C9EB" w:themeFill="text2" w:themeFillTint="40"/>
+            <w:hideMark/>
+          </w:tcPr>
+          <w:p>
+            <w:pPr>
+              <w:pStyle w:val="NoSpacing"/>
+            </w:pPr>
+            <w:r>
+              <w:t>Metric Category</w:t>
+            </w:r>
+          </w:p>
+        </w:tc>
+        <w:tc>
+          <w:tcPr>
+            <w:tcW w:w="0" w:type="auto"/>
+            <w:shd w:val="clear" w:color="auto" w:fill="A5C9EB" w:themeFill="text2" w:themeFillTint="40"/>
+            <w:hideMark/>
+          </w:tcPr>
+          <w:p>
+            <w:pPr>
+              <w:pStyle w:val="NoSpacing"/>
+              <w:cnfStyle w:val="100000000000" w:firstRow="1" w:lastRow="0" w:firstColumn="0" w:lastColumn="0" w:oddVBand="0" w:evenVBand="0" w:oddHBand="0" w:evenHBand="0" w:firstRowFirstColumn="0" w:firstRowLastColumn="0" w:lastRowFirstColumn="0" w:lastRowLastColumn="0"/>
+            </w:pPr>
+            <w:r>
+              <w:t>Baseline Model</w:t>
+            </w:r>
+          </w:p>
+        </w:tc>
+        <w:tc>
+          <w:tcPr>
+            <w:tcW w:w="0" w:type="auto"/>
+            <w:shd w:val="clear" w:color="auto" w:fill="A5C9EB" w:themeFill="text2" w:themeFillTint="40"/>
+            <w:hideMark/>
+          </w:tcPr>
+          <w:p>
+            <w:pPr>
+              <w:pStyle w:val="NoSpacing"/>
+              <w:cnfStyle w:val="100000000000" w:firstRow="1" w:lastRow="0" w:firstColumn="0" w:lastColumn="0" w:oddVBand="0" w:evenVBand="0" w:oddHBand="0" w:evenHBand="0" w:firstRowFirstColumn="0" w:firstRowLastColumn="0" w:lastRowFirstColumn="0" w:lastRowLastColumn="0"/>
+            </w:pPr>
+            <w:r>
+              <w:t>Proposed Multi-Task Model</w:t>
+            </w:r>
+          </w:p>
+        </w:tc>
+        <w:tc>
+          <w:tcPr>
+            <w:tcW w:w="0" w:type="auto"/>
+            <w:shd w:val="clear" w:color="auto" w:fill="A5C9EB" w:themeFill="text2" w:themeFillTint="40"/>
+            <w:hideMark/>
+          </w:tcPr>
+          <w:p>
+            <w:pPr>
+              <w:pStyle w:val="NoSpacing"/>
+              <w:cnfStyle w:val="100000000000" w:firstRow="1" w:lastRow="0" w:firstColumn="0" w:lastColumn="0" w:oddVBand="0" w:evenVBand="0" w:oddHBand="0" w:evenHBand="0" w:firstRowFirstColumn="0" w:firstRowLastColumn="0" w:lastRowFirstColumn="0" w:lastRowLastColumn="0"/>
+            </w:pPr>
+            <w:r>
+              <w:t>Improvement / Status</w:t>
+            </w:r>
+          </w:p>
+        </w:tc>
+      </w:tr>
+      <w:tr>
+        <w:trPr>
+          <w:cnfStyle w:val="000000100000" w:firstRow="0" w:lastRow="0" w:firstColumn="0" w:lastColumn="0" w:oddVBand="0" w:evenVBand="0" w:oddHBand="1" w:evenHBand="0" w:firstRowFirstColumn="0" w:firstRowLastColumn="0" w:lastRowFirstColumn="0" w:lastRowLastColumn="0"/>
+        </w:trPr>
+        <w:tc>
+          <w:tcPr>
+            <w:cnfStyle w:val="001000000000" w:firstRow="0" w:lastRow="0" w:firstColumn="1" w:lastColumn="0" w:oddVBand="0" w:evenVBand="0" w:oddHBand="0" w:evenHBand="0" w:firstRowFirstColumn="0" w:firstRowLastColumn="0" w:lastRowFirstColumn="0" w:lastRowLastColumn="0"/>
+            <w:tcW w:w="0" w:type="auto"/>
+            <w:hideMark/>
+          </w:tcPr>
+          <w:p>
+            <w:pPr>
+              <w:pStyle w:val="NoSpacing"/>
+              <w:rPr>
+                <w:b w:val="0"/>
+                <w:bCs w:val="0"/>
+              </w:rPr>
+            </w:pPr>
+            <w:r>
+              <w:rPr>
+                <w:b w:val="0"/>
+                <w:bCs w:val="0"/>
+              </w:rPr>
+              <w:t>Task 1: Delay Detection</w:t>
+            </w:r>
+          </w:p>
+        </w:tc>
+        <w:tc>
+          <w:tcPr>
+            <w:tcW w:w="0" w:type="auto"/>
+            <w:hideMark/>
+          </w:tcPr>
+          <w:p>
+            <w:pPr>
+              <w:pStyle w:val="NoSpacing"/>
+              <w:cnfStyle w:val="000000100000" w:firstRow="0" w:lastRow="0" w:firstColumn="0" w:lastColumn="0" w:oddVBand="0" w:evenVBand="0" w:oddHBand="1" w:evenHBand="0" w:firstRowFirstColumn="0" w:firstRowLastColumn="0" w:lastRowFirstColumn="0" w:lastRowLastColumn="0"/>
+            </w:pPr>
+            <w:r>
+              <w:t>Not Capable</w:t>
+            </w:r>
+          </w:p>
+        </w:tc>
+        <w:tc>
+          <w:tcPr>
+            <w:tcW w:w="0" w:type="auto"/>
+            <w:hideMark/>
+          </w:tcPr>
+          <w:p>
+            <w:pPr>
+              <w:pStyle w:val="NoSpacing"/>
+              <w:cnfStyle w:val="000000100000" w:firstRow="0" w:lastRow="0" w:firstColumn="0" w:lastColumn="0" w:oddVBand="0" w:evenVBand="0" w:oddHBand="1" w:evenHBand="0" w:firstRowFirstColumn="0" w:firstRowLastColumn="0" w:lastRowFirstColumn="0" w:lastRowLastColumn="0"/>
+            </w:pPr>
+            <w:r>
+              <w:t>56.28% Accuracy</w:t>
+            </w:r>
+          </w:p>
+        </w:tc>
+        <w:tc>
+          <w:tcPr>
+            <w:tcW w:w="0" w:type="auto"/>
+            <w:hideMark/>
+          </w:tcPr>
+          <w:p>
+            <w:pPr>
+              <w:pStyle w:val="NoSpacing"/>
+              <w:cnfStyle w:val="000000100000" w:firstRow="0" w:lastRow="0" w:firstColumn="0" w:lastColumn="0" w:oddVBand="0" w:evenVBand="0" w:oddHBand="1" w:evenHBand="0" w:firstRowFirstColumn="0" w:firstRowLastColumn="0" w:lastRowFirstColumn="0" w:lastRowLastColumn="0"/>
+            </w:pPr>
+            <w:r>
+              <w:t>New Feature</w:t>
+            </w:r>
+          </w:p>
+        </w:tc>
+      </w:tr>
+      <w:tr>
+        <w:tc>
+          <w:tcPr>
+            <w:cnfStyle w:val="001000000000" w:firstRow="0" w:lastRow="0" w:firstColumn="1" w:lastColumn="0" w:oddVBand="0" w:evenVBand="0" w:oddHBand="0" w:evenHBand="0" w:firstRowFirstColumn="0" w:firstRowLastColumn="0" w:lastRowFirstColumn="0" w:lastRowLastColumn="0"/>
+            <w:tcW w:w="0" w:type="auto"/>
+            <w:hideMark/>
+          </w:tcPr>
+          <w:p>
+            <w:pPr>
+              <w:pStyle w:val="NoSpacing"/>
+              <w:rPr>
+                <w:b w:val="0"/>
+                <w:bCs w:val="0"/>
+              </w:rPr>
+            </w:pPr>
+            <w:r>
+              <w:rPr>
+                <w:b w:val="0"/>
+                <w:bCs w:val="0"/>
+              </w:rPr>
+              <w:t>Task 2: Primary Reason</w:t>
+            </w:r>
+          </w:p>
+        </w:tc>
+        <w:tc>
+          <w:tcPr>
+            <w:tcW w:w="0" w:type="auto"/>
+            <w:hideMark/>
+          </w:tcPr>
+          <w:p>
+            <w:pPr>
+              <w:pStyle w:val="NoSpacing"/>
+              <w:cnfStyle w:val="000000000000" w:firstRow="0" w:lastRow="0" w:firstColumn="0" w:lastColumn="0" w:oddVBand="0" w:evenVBand="0" w:oddHBand="0" w:evenHBand="0" w:firstRowFirstColumn="0" w:firstRowLastColumn="0" w:lastRowFirstColumn="0" w:lastRowLastColumn="0"/>
+            </w:pPr>
+            <w:r>
+              <w:t>Not Capable</w:t>
+            </w:r>
+          </w:p>
+        </w:tc>
+        <w:tc>
+          <w:tcPr>
+            <w:tcW w:w="0" w:type="auto"/>
+            <w:hideMark/>
+          </w:tcPr>
+          <w:p>
+            <w:pPr>
+              <w:pStyle w:val="NoSpacing"/>
+              <w:cnfStyle w:val="000000000000" w:firstRow="0" w:lastRow="0" w:firstColumn="0" w:lastColumn="0" w:oddVBand="0" w:evenVBand="0" w:oddHBand="0" w:evenHBand="0" w:firstRowFirstColumn="0" w:firstRowLastColumn="0" w:lastRowFirstColumn="0" w:lastRowLastColumn="0"/>
+            </w:pPr>
+            <w:r>
+              <w:t>63.00% Accuracy</w:t>
+            </w:r>
+          </w:p>
+        </w:tc>
+        <w:tc>
+          <w:tcPr>
+            <w:tcW w:w="0" w:type="auto"/>
+            <w:hideMark/>
+          </w:tcPr>
+          <w:p>
+            <w:pPr>
+              <w:pStyle w:val="NoSpacing"/>
+              <w:cnfStyle w:val="000000000000" w:firstRow="0" w:lastRow="0" w:firstColumn="0" w:lastColumn="0" w:oddVBand="0" w:evenVBand="0" w:oddHBand="0" w:evenHBand="0" w:firstRowFirstColumn="0" w:firstRowLastColumn="0" w:lastRowFirstColumn="0" w:lastRowLastColumn="0"/>
+            </w:pPr>
+            <w:r>
+              <w:t>New Feature</w:t>
+            </w:r>
+          </w:p>
+        </w:tc>
+      </w:tr>
+      <w:tr>
+        <w:trPr>
+          <w:cnfStyle w:val="000000100000" w:firstRow="0" w:lastRow="0" w:firstColumn="0" w:lastColumn="0" w:oddVBand="0" w:evenVBand="0" w:oddHBand="1" w:evenHBand="0" w:firstRowFirstColumn="0" w:firstRowLastColumn="0" w:lastRowFirstColumn="0" w:lastRowLastColumn="0"/>
+        </w:trPr>
+        <w:tc>
+          <w:tcPr>
+            <w:cnfStyle w:val="001000000000" w:firstRow="0" w:lastRow="0" w:firstColumn="1" w:lastColumn="0" w:oddVBand="0" w:evenVBand="0" w:oddHBand="0" w:evenHBand="0" w:firstRowFirstColumn="0" w:firstRowLastColumn="0" w:lastRowFirstColumn="0" w:lastRowLastColumn="0"/>
+            <w:tcW w:w="0" w:type="auto"/>
+            <w:shd w:val="clear" w:color="auto" w:fill="C1E4F5" w:themeFill="accent1" w:themeFillTint="33"/>
+            <w:hideMark/>
+          </w:tcPr>
+          <w:p>
+            <w:pPr>
+              <w:pStyle w:val="NoSpacing"/>
+              <w:rPr>
+                <w:b w:val="0"/>
+                <w:bCs w:val="0"/>
+              </w:rPr>
+            </w:pPr>
+            <w:r>
+              <w:rPr>
+                <w:b w:val="0"/>
+                <w:bCs w:val="0"/>
+              </w:rPr>
+              <w:t>Task 3: Carrier MAE</w:t>
+            </w:r>
+          </w:p>
+        </w:tc>
+        <w:tc>
+          <w:tcPr>
+            <w:tcW w:w="0" w:type="auto"/>
+            <w:shd w:val="clear" w:color="auto" w:fill="C1E4F5" w:themeFill="accent1" w:themeFillTint="33"/>
+            <w:hideMark/>
+          </w:tcPr>
+          <w:p>
+            <w:pPr>
+              <w:pStyle w:val="NoSpacing"/>
+              <w:cnfStyle w:val="000000100000" w:firstRow="0" w:lastRow="0" w:firstColumn="0" w:lastColumn="0" w:oddVBand="0" w:evenVBand="0" w:oddHBand="1" w:evenHBand="0" w:firstRowFirstColumn="0" w:firstRowLastColumn="0" w:lastRowFirstColumn="0" w:lastRowLastColumn="0"/>
+            </w:pPr>
+            <w:r>
+              <w:t>18.69 min</w:t>
+            </w:r>
+          </w:p>
+        </w:tc>
+        <w:tc>
+          <w:tcPr>
+            <w:tcW w:w="0" w:type="auto"/>
+            <w:shd w:val="clear" w:color="auto" w:fill="C1E4F5" w:themeFill="accent1" w:themeFillTint="33"/>
+            <w:hideMark/>
+          </w:tcPr>
+          <w:p>
+            <w:pPr>
+              <w:pStyle w:val="NoSpacing"/>
+              <w:cnfStyle w:val="000000100000" w:firstRow="0" w:lastRow="0" w:firstColumn="0" w:lastColumn="0" w:oddVBand="0" w:evenVBand="0" w:oddHBand="1" w:evenHBand="0" w:firstRowFirstColumn="0" w:firstRowLastColumn="0" w:lastRowFirstColumn="0" w:lastRowLastColumn="0"/>
+            </w:pPr>
+            <w:r>
+              <w:t>12.28 min</w:t>
+            </w:r>
+          </w:p>
+        </w:tc>
+        <w:tc>
+          <w:tcPr>
+            <w:tcW w:w="0" w:type="auto"/>
+            <w:shd w:val="clear" w:color="auto" w:fill="C1E4F5" w:themeFill="accent1" w:themeFillTint="33"/>
+            <w:hideMark/>
+          </w:tcPr>
+          <w:p>
+            <w:pPr>
+              <w:pStyle w:val="NoSpacing"/>
+              <w:cnfStyle w:val="000000100000" w:firstRow="0" w:lastRow="0" w:firstColumn="0" w:lastColumn="0" w:oddVBand="0" w:evenVBand="0" w:oddHBand="1" w:evenHBand="0" w:firstRowFirstColumn="0" w:firstRowLastColumn="0" w:lastRowFirstColumn="0" w:lastRowLastColumn="0"/>
+            </w:pPr>
+            <w:r>
+              <w:t>34% Reduction</w:t>
+            </w:r>
+          </w:p>
+        </w:tc>
+      </w:tr>
+      <w:tr>
+        <w:tc>
+          <w:tcPr>
+            <w:cnfStyle w:val="001000000000" w:firstRow="0" w:lastRow="0" w:firstColumn="1" w:lastColumn="0" w:oddVBand="0" w:evenVBand="0" w:oddHBand="0" w:evenHBand="0" w:firstRowFirstColumn="0" w:firstRowLastColumn="0" w:lastRowFirstColumn="0" w:lastRowLastColumn="0"/>
+            <w:tcW w:w="0" w:type="auto"/>
+            <w:hideMark/>
+          </w:tcPr>
+          <w:p>
+            <w:pPr>
+              <w:pStyle w:val="NoSpacing"/>
+              <w:rPr>
+                <w:b w:val="0"/>
+                <w:bCs w:val="0"/>
+              </w:rPr>
+            </w:pPr>
+            <w:r>
+              <w:rPr>
+                <w:b w:val="0"/>
+                <w:bCs w:val="0"/>
+              </w:rPr>
+              <w:t>Task 3: Airport MAE</w:t>
+            </w:r>
+          </w:p>
+        </w:tc>
+        <w:tc>
+          <w:tcPr>
+            <w:tcW w:w="0" w:type="auto"/>
+            <w:hideMark/>
+          </w:tcPr>
+          <w:p>
+            <w:pPr>
+              <w:pStyle w:val="NoSpacing"/>
+              <w:cnfStyle w:val="000000000000" w:firstRow="0" w:lastRow="0" w:firstColumn="0" w:lastColumn="0" w:oddVBand="0" w:evenVBand="0" w:oddHBand="0" w:evenHBand="0" w:firstRowFirstColumn="0" w:firstRowLastColumn="0" w:lastRowFirstColumn="0" w:lastRowLastColumn="0"/>
+            </w:pPr>
+            <w:r>
+              <w:t>12.44 min</w:t>
+            </w:r>
+          </w:p>
+        </w:tc>
+        <w:tc>
+          <w:tcPr>
+            <w:tcW w:w="0" w:type="auto"/>
+            <w:hideMark/>
+          </w:tcPr>
+          <w:p>
+            <w:pPr>
+              <w:pStyle w:val="NoSpacing"/>
+              <w:cnfStyle w:val="000000000000" w:firstRow="0" w:lastRow="0" w:firstColumn="0" w:lastColumn="0" w:oddVBand="0" w:evenVBand="0" w:oddHBand="0" w:evenHBand="0" w:firstRowFirstColumn="0" w:firstRowLastColumn="0" w:lastRowFirstColumn="0" w:lastRowLastColumn="0"/>
+            </w:pPr>
+            <w:r>
+              <w:t>2.56 min</w:t>
+            </w:r>
+          </w:p>
+        </w:tc>
+        <w:tc>
+          <w:tcPr>
+            <w:tcW w:w="0" w:type="auto"/>
+            <w:hideMark/>
+          </w:tcPr>
+          <w:p>
+            <w:pPr>
+              <w:pStyle w:val="NoSpacing"/>
+              <w:cnfStyle w:val="000000000000" w:firstRow="0" w:lastRow="0" w:firstColumn="0" w:lastColumn="0" w:oddVBand="0" w:evenVBand="0" w:oddHBand="0" w:evenHBand="0" w:firstRowFirstColumn="0" w:firstRowLastColumn="0" w:lastRowFirstColumn="0" w:lastRowLastColumn="0"/>
+            </w:pPr>
+            <w:r>
+              <w:t>79% Reduction</w:t>
+            </w:r>
+          </w:p>
+        </w:tc>
+      </w:tr>
+      <w:tr>
+        <w:trPr>
+          <w:cnfStyle w:val="000000100000" w:firstRow="0" w:lastRow="0" w:firstColumn="0" w:lastColumn="0" w:oddVBand="0" w:evenVBand="0" w:oddHBand="1" w:evenHBand="0" w:firstRowFirstColumn="0" w:firstRowLastColumn="0" w:lastRowFirstColumn="0" w:lastRowLastColumn="0"/>
+        </w:trPr>
+        <w:tc>
+          <w:tcPr>
+            <w:cnfStyle w:val="001000000000" w:firstRow="0" w:lastRow="0" w:firstColumn="1" w:lastColumn="0" w:oddVBand="0" w:evenVBand="0" w:oddHBand="0" w:evenHBand="0" w:firstRowFirstColumn="0" w:firstRowLastColumn="0" w:lastRowFirstColumn="0" w:lastRowLastColumn="0"/>
+            <w:tcW w:w="0" w:type="auto"/>
+            <w:hideMark/>
+          </w:tcPr>
+          <w:p>
+            <w:pPr>
+              <w:pStyle w:val="NoSpacing"/>
+              <w:rPr>
+                <w:b w:val="0"/>
+                <w:bCs w:val="0"/>
+              </w:rPr>
+            </w:pPr>
+            <w:r>
+              <w:rPr>
+                <w:b w:val="0"/>
+                <w:bCs w:val="0"/>
+              </w:rPr>
+              <w:t>Task 3: Late Aircraft MAE</w:t>
+            </w:r>
+          </w:p>
+        </w:tc>
+        <w:tc>
+          <w:tcPr>
+            <w:tcW w:w="0" w:type="auto"/>
+            <w:hideMark/>
+          </w:tcPr>
+          <w:p>
+            <w:pPr>
+              <w:pStyle w:val="NoSpacing"/>
+              <w:cnfStyle w:val="000000100000" w:firstRow="0" w:lastRow="0" w:firstColumn="0" w:lastColumn="0" w:oddVBand="0" w:evenVBand="0" w:oddHBand="1" w:evenHBand="0" w:firstRowFirstColumn="0" w:firstRowLastColumn="0" w:lastRowFirstColumn="0" w:lastRowLastColumn="0"/>
+            </w:pPr>
+            <w:r>
+              <w:t>24.61 min</w:t>
+            </w:r>
+          </w:p>
+        </w:tc>
+        <w:tc>
+          <w:tcPr>
+            <w:tcW w:w="0" w:type="auto"/>
+            <w:hideMark/>
+          </w:tcPr>
+          <w:p>
+            <w:pPr>
+              <w:pStyle w:val="NoSpacing"/>
+              <w:cnfStyle w:val="000000100000" w:firstRow="0" w:lastRow="0" w:firstColumn="0" w:lastColumn="0" w:oddVBand="0" w:evenVBand="0" w:oddHBand="1" w:evenHBand="0" w:firstRowFirstColumn="0" w:firstRowLastColumn="0" w:lastRowFirstColumn="0" w:lastRowLastColumn="0"/>
+            </w:pPr>
+            <w:r>
+              <w:t>15.36 min</w:t>
+            </w:r>
+          </w:p>
+        </w:tc>
+        <w:tc>
+          <w:tcPr>
+            <w:tcW w:w="0" w:type="auto"/>
+            <w:hideMark/>
+          </w:tcPr>
+          <w:p>
+            <w:pPr>
+              <w:pStyle w:val="NoSpacing"/>
+              <w:cnfStyle w:val="000000100000" w:firstRow="0" w:lastRow="0" w:firstColumn="0" w:lastColumn="0" w:oddVBand="0" w:evenVBand="0" w:oddHBand="1" w:evenHBand="0" w:firstRowFirstColumn="0" w:firstRowLastColumn="0" w:lastRowFirstColumn="0" w:lastRowLastColumn="0"/>
+            </w:pPr>
+            <w:r>
+              <w:t>37% Reduction</w:t>
+            </w:r>
+          </w:p>
+        </w:tc>
+      </w:tr>
+      <w:tr>
+        <w:tc>
+          <w:tcPr>
+            <w:cnfStyle w:val="001000000000" w:firstRow="0" w:lastRow="0" w:firstColumn="1" w:lastColumn="0" w:oddVBand="0" w:evenVBand="0" w:oddHBand="0" w:evenHBand="0" w:firstRowFirstColumn="0" w:firstRowLastColumn="0" w:lastRowFirstColumn="0" w:lastRowLastColumn="0"/>
+            <w:tcW w:w="0" w:type="auto"/>
+            <w:shd w:val="clear" w:color="auto" w:fill="C1E4F5" w:themeFill="accent1" w:themeFillTint="33"/>
+          </w:tcPr>
+          <w:p>
+            <w:pPr>
+              <w:pStyle w:val="NoSpacing"/>
+              <w:rPr>
+                <w:b w:val="0"/>
+                <w:bCs w:val="0"/>
+              </w:rPr>
+            </w:pPr>
+            <w:r>
+              <w:rPr>
+                <w:b w:val="0"/>
+                <w:bCs w:val="0"/>
+              </w:rPr>
+              <w:t>Task 3: Security Delay</w:t>
+            </w:r>
+          </w:p>
+        </w:tc>
+        <w:tc>
+          <w:tcPr>
+            <w:tcW w:w="0" w:type="auto"/>
+            <w:shd w:val="clear" w:color="auto" w:fill="C1E4F5" w:themeFill="accent1" w:themeFillTint="33"/>
+          </w:tcPr>
+          <w:p>
+            <w:pPr>
+              <w:pStyle w:val="NoSpacing"/>
+              <w:cnfStyle w:val="000000000000" w:firstRow="0" w:lastRow="0" w:firstColumn="0" w:lastColumn="0" w:oddVBand="0" w:evenVBand="0" w:oddHBand="0" w:evenHBand="0" w:firstRowFirstColumn="0" w:firstRowLastColumn="0" w:lastRowFirstColumn="0" w:lastRowLastColumn="0"/>
+            </w:pPr>
+            <w:r>
+              <w:t>0.05 min</w:t>
+            </w:r>
+          </w:p>
+        </w:tc>
+        <w:tc>
+          <w:tcPr>
+            <w:tcW w:w="0" w:type="auto"/>
+            <w:shd w:val="clear" w:color="auto" w:fill="C1E4F5" w:themeFill="accent1" w:themeFillTint="33"/>
+          </w:tcPr>
+          <w:p>
+            <w:pPr>
+              <w:pStyle w:val="NoSpacing"/>
+              <w:cnfStyle w:val="000000000000" w:firstRow="0" w:lastRow="0" w:firstColumn="0" w:lastColumn="0" w:oddVBand="0" w:evenVBand="0" w:oddHBand="0" w:evenHBand="0" w:firstRowFirstColumn="0" w:firstRowLastColumn="0" w:lastRowFirstColumn="0" w:lastRowLastColumn="0"/>
+            </w:pPr>
+            <w:r>
+              <w:t>0.06 min</w:t>
+            </w:r>
+          </w:p>
+        </w:tc>
+        <w:tc>
+          <w:tcPr>
+            <w:tcW w:w="0" w:type="auto"/>
+            <w:shd w:val="clear" w:color="auto" w:fill="C1E4F5" w:themeFill="accent1" w:themeFillTint="33"/>
+          </w:tcPr>
+          <w:p>
+            <w:pPr>
+              <w:pStyle w:val="NoSpacing"/>
+              <w:cnfStyle w:val="000000000000" w:firstRow="0" w:lastRow="0" w:firstColumn="0" w:lastColumn="0" w:oddVBand="0" w:evenVBand="0" w:oddHBand="0" w:evenHBand="0" w:firstRowFirstColumn="0" w:firstRowLastColumn="0" w:lastRowFirstColumn="0" w:lastRowLastColumn="0"/>
+            </w:pPr>
+            <w:r>
+              <w:t>Minimal Difference</w:t>
+            </w:r>
+          </w:p>
+        </w:tc>
+      </w:tr>
+      <w:tr>
+        <w:trPr>
+          <w:cnfStyle w:val="000000100000" w:firstRow="0" w:lastRow="0" w:firstColumn="0" w:lastColumn="0" w:oddVBand="0" w:evenVBand="0" w:oddHBand="1" w:evenHBand="0" w:firstRowFirstColumn="0" w:firstRowLastColumn="0" w:lastRowFirstColumn="0" w:lastRowLastColumn="0"/>
+        </w:trPr>
+        <w:tc>
+          <w:tcPr>
+            <w:cnfStyle w:val="001000000000" w:firstRow="0" w:lastRow="0" w:firstColumn="1" w:lastColumn="0" w:oddVBand="0" w:evenVBand="0" w:oddHBand="0" w:evenHBand="0" w:firstRowFirstColumn="0" w:firstRowLastColumn="0" w:lastRowFirstColumn="0" w:lastRowLastColumn="0"/>
+            <w:tcW w:w="0" w:type="auto"/>
+            <w:hideMark/>
+          </w:tcPr>
+          <w:p>
+            <w:pPr>
+              <w:pStyle w:val="NoSpacing"/>
+            </w:pPr>
+            <w:r>
+              <w:lastRenderedPageBreak/>
+              <w:t>Task 3: Weather MAE</w:t>
+            </w:r>
+          </w:p>
+        </w:tc>
+        <w:tc>
+          <w:tcPr>
+            <w:tcW w:w="0" w:type="auto"/>
+            <w:hideMark/>
+          </w:tcPr>
+          <w:p>
+            <w:pPr>
+              <w:pStyle w:val="NoSpacing"/>
+              <w:cnfStyle w:val="000000100000" w:firstRow="0" w:lastRow="0" w:firstColumn="0" w:lastColumn="0" w:oddVBand="0" w:evenVBand="0" w:oddHBand="1" w:evenHBand="0" w:firstRowFirstColumn="0" w:firstRowLastColumn="0" w:lastRowFirstColumn="0" w:lastRowLastColumn="0"/>
+            </w:pPr>
+            <w:r>
+              <w:t>6.28 min</w:t>
+            </w:r>
+          </w:p>
+        </w:tc>
+        <w:tc>
+          <w:tcPr>
+            <w:tcW w:w="0" w:type="auto"/>
+            <w:hideMark/>
+          </w:tcPr>
+          <w:p>
+            <w:pPr>
+              <w:pStyle w:val="NoSpacing"/>
+              <w:cnfStyle w:val="000000100000" w:firstRow="0" w:lastRow="0" w:firstColumn="0" w:lastColumn="0" w:oddVBand="0" w:evenVBand="0" w:oddHBand="1" w:evenHBand="0" w:firstRowFirstColumn="0" w:firstRowLastColumn="0" w:lastRowFirstColumn="0" w:lastRowLastColumn="0"/>
+            </w:pPr>
+            <w:r>
+              <w:t>8.60 min</w:t>
+            </w:r>
+          </w:p>
+        </w:tc>
+        <w:tc>
+          <w:tcPr>
+            <w:tcW w:w="0" w:type="auto"/>
+            <w:hideMark/>
+          </w:tcPr>
+          <w:p>
+            <w:pPr>
+              <w:pStyle w:val="NoSpacing"/>
+              <w:cnfStyle w:val="000000100000" w:firstRow="0" w:lastRow="0" w:firstColumn="0" w:lastColumn="0" w:oddVBand="0" w:evenVBand="0" w:oddHBand="1" w:evenHBand="0" w:firstRowFirstColumn="0" w:firstRowLastColumn="0" w:lastRowFirstColumn="0" w:lastRowLastColumn="0"/>
+            </w:pPr>
+            <w:r>
+              <w:t>Baseline +2.32 min</w:t>
+            </w:r>
+          </w:p>
+        </w:tc>
+      </w:tr>
+    </w:tbl>
+    <w:p/>
     <w:sectPr>
       <w:pgSz w:w="12240" w:h="15840"/>
       <w:pgMar w:top="1440" w:right="1440" w:bottom="1440" w:left="1440" w:header="720" w:footer="720" w:gutter="0"/>
@@ -4060,6 +5473,7 @@
   <w:style w:type="character" w:default="1" w:styleId="DefaultParagraphFont">
     <w:name w:val="Default Paragraph Font"/>
     <w:uiPriority w:val="1"/>
+    <w:semiHidden/>
     <w:unhideWhenUsed/>
   </w:style>
   <w:style w:type="table" w:default="1" w:styleId="TableNormal">
@@ -4372,6 +5786,176 @@
       <w:color w:val="0F4761" w:themeColor="accent1" w:themeShade="BF"/>
       <w:spacing w:val="5"/>
     </w:rPr>
+  </w:style>
+  <w:style w:type="paragraph" w:styleId="NoSpacing">
+    <w:name w:val="No Spacing"/>
+    <w:uiPriority w:val="1"/>
+    <w:qFormat/>
+    <w:rsid w:val="003F5CA5"/>
+    <w:pPr>
+      <w:spacing w:after="0" w:line="240" w:lineRule="auto"/>
+    </w:pPr>
+  </w:style>
+  <w:style w:type="table" w:styleId="TableGridLight">
+    <w:name w:val="Grid Table Light"/>
+    <w:basedOn w:val="TableNormal"/>
+    <w:uiPriority w:val="40"/>
+    <w:rsid w:val="003F5CA5"/>
+    <w:pPr>
+      <w:spacing w:after="0" w:line="240" w:lineRule="auto"/>
+    </w:pPr>
+    <w:tblPr>
+      <w:tblBorders>
+        <w:top w:val="single" w:sz="4" w:space="0" w:color="BFBFBF" w:themeColor="background1" w:themeShade="BF"/>
+        <w:left w:val="single" w:sz="4" w:space="0" w:color="BFBFBF" w:themeColor="background1" w:themeShade="BF"/>
+        <w:bottom w:val="single" w:sz="4" w:space="0" w:color="BFBFBF" w:themeColor="background1" w:themeShade="BF"/>
+        <w:right w:val="single" w:sz="4" w:space="0" w:color="BFBFBF" w:themeColor="background1" w:themeShade="BF"/>
+        <w:insideH w:val="single" w:sz="4" w:space="0" w:color="BFBFBF" w:themeColor="background1" w:themeShade="BF"/>
+        <w:insideV w:val="single" w:sz="4" w:space="0" w:color="BFBFBF" w:themeColor="background1" w:themeShade="BF"/>
+      </w:tblBorders>
+    </w:tblPr>
+  </w:style>
+  <w:style w:type="table" w:styleId="PlainTable4">
+    <w:name w:val="Plain Table 4"/>
+    <w:basedOn w:val="TableNormal"/>
+    <w:uiPriority w:val="44"/>
+    <w:rsid w:val="00EA51B5"/>
+    <w:pPr>
+      <w:spacing w:after="0" w:line="240" w:lineRule="auto"/>
+    </w:pPr>
+    <w:tblPr>
+      <w:tblStyleRowBandSize w:val="1"/>
+      <w:tblStyleColBandSize w:val="1"/>
+    </w:tblPr>
+    <w:tblStylePr w:type="firstRow">
+      <w:rPr>
+        <w:b/>
+        <w:bCs/>
+      </w:rPr>
+    </w:tblStylePr>
+    <w:tblStylePr w:type="lastRow">
+      <w:rPr>
+        <w:b/>
+        <w:bCs/>
+      </w:rPr>
+    </w:tblStylePr>
+    <w:tblStylePr w:type="firstCol">
+      <w:rPr>
+        <w:b/>
+        <w:bCs/>
+      </w:rPr>
+    </w:tblStylePr>
+    <w:tblStylePr w:type="lastCol">
+      <w:rPr>
+        <w:b/>
+        <w:bCs/>
+      </w:rPr>
+    </w:tblStylePr>
+    <w:tblStylePr w:type="band1Vert">
+      <w:tblPr/>
+      <w:tcPr>
+        <w:shd w:val="clear" w:color="auto" w:fill="F2F2F2" w:themeFill="background1" w:themeFillShade="F2"/>
+      </w:tcPr>
+    </w:tblStylePr>
+    <w:tblStylePr w:type="band1Horz">
+      <w:tblPr/>
+      <w:tcPr>
+        <w:shd w:val="clear" w:color="auto" w:fill="F2F2F2" w:themeFill="background1" w:themeFillShade="F2"/>
+      </w:tcPr>
+    </w:tblStylePr>
+  </w:style>
+  <w:style w:type="table" w:styleId="PlainTable3">
+    <w:name w:val="Plain Table 3"/>
+    <w:basedOn w:val="TableNormal"/>
+    <w:uiPriority w:val="43"/>
+    <w:rsid w:val="00C57856"/>
+    <w:pPr>
+      <w:spacing w:after="0" w:line="240" w:lineRule="auto"/>
+    </w:pPr>
+    <w:tblPr>
+      <w:tblStyleRowBandSize w:val="1"/>
+      <w:tblStyleColBandSize w:val="1"/>
+    </w:tblPr>
+    <w:tblStylePr w:type="firstRow">
+      <w:rPr>
+        <w:b/>
+        <w:bCs/>
+        <w:caps/>
+      </w:rPr>
+      <w:tblPr/>
+      <w:tcPr>
+        <w:tcBorders>
+          <w:bottom w:val="single" w:sz="4" w:space="0" w:color="7F7F7F" w:themeColor="text1" w:themeTint="80"/>
+        </w:tcBorders>
+      </w:tcPr>
+    </w:tblStylePr>
+    <w:tblStylePr w:type="lastRow">
+      <w:rPr>
+        <w:b/>
+        <w:bCs/>
+        <w:caps/>
+      </w:rPr>
+      <w:tblPr/>
+      <w:tcPr>
+        <w:tcBorders>
+          <w:top w:val="nil"/>
+        </w:tcBorders>
+      </w:tcPr>
+    </w:tblStylePr>
+    <w:tblStylePr w:type="firstCol">
+      <w:rPr>
+        <w:b/>
+        <w:bCs/>
+        <w:caps/>
+      </w:rPr>
+      <w:tblPr/>
+      <w:tcPr>
+        <w:tcBorders>
+          <w:right w:val="single" w:sz="4" w:space="0" w:color="7F7F7F" w:themeColor="text1" w:themeTint="80"/>
+        </w:tcBorders>
+      </w:tcPr>
+    </w:tblStylePr>
+    <w:tblStylePr w:type="lastCol">
+      <w:rPr>
+        <w:b/>
+        <w:bCs/>
+        <w:caps/>
+      </w:rPr>
+      <w:tblPr/>
+      <w:tcPr>
+        <w:tcBorders>
+          <w:left w:val="nil"/>
+        </w:tcBorders>
+      </w:tcPr>
+    </w:tblStylePr>
+    <w:tblStylePr w:type="band1Vert">
+      <w:tblPr/>
+      <w:tcPr>
+        <w:shd w:val="clear" w:color="auto" w:fill="F2F2F2" w:themeFill="background1" w:themeFillShade="F2"/>
+      </w:tcPr>
+    </w:tblStylePr>
+    <w:tblStylePr w:type="band1Horz">
+      <w:tblPr/>
+      <w:tcPr>
+        <w:shd w:val="clear" w:color="auto" w:fill="F2F2F2" w:themeFill="background1" w:themeFillShade="F2"/>
+      </w:tcPr>
+    </w:tblStylePr>
+    <w:tblStylePr w:type="neCell">
+      <w:tblPr/>
+      <w:tcPr>
+        <w:tcBorders>
+          <w:left w:val="nil"/>
+        </w:tcBorders>
+      </w:tcPr>
+    </w:tblStylePr>
+    <w:tblStylePr w:type="nwCell">
+      <w:tblPr/>
+      <w:tcPr>
+        <w:tcBorders>
+          <w:right w:val="nil"/>
+        </w:tcBorders>
+      </w:tcPr>
+    </w:tblStylePr>
   </w:style>
 </w:styles>
 </file>

</xml_diff>